<commit_message>
Add dynamic views for web app requirement
</commit_message>
<xml_diff>
--- a/W04_Submit_Module_2_UPDATED.docx
+++ b/W04_Submit_Module_2_UPDATED.docx
@@ -86,7 +86,7 @@
     </w:p>
     <w:p>
       <w:r>
-        <w:t>24-Hour Routine Planner is a React and Vite web application that helps plan and track a complete Saturday routine. The user can add, edit, delete, complete, search, and filter routine blocks across Sleep, Work, Study, Family, Prayer, Reflection, and Personal Care. The app calculates scheduled hours, completed hours, day progress toward a 24-hour goal, open routine block count, and hours by category. Routine data is saved in browser local storage so the plan remains available after refreshing the page.</w:t>
+        <w:t>24-Hour Routine Planner is a React and Vite web application that helps plan and track a complete Saturday routine. The user can add, edit, delete, complete, search, and filter routine blocks across Sleep, Work, Study, Family, Prayer, Reflection, and Personal Care. The app calculates scheduled hours, completed hours, day progress toward a 24-hour goal, open routine block count, and hours by category. It also includes three dynamically generated React views: Planner, Day Summary, and Completion Review. Routine data is saved in browser local storage so the plan remains available after refreshing the page.</w:t>
       </w:r>
     </w:p>
     <w:p>
@@ -183,7 +183,7 @@
           </w:tcPr>
           <w:p>
             <w:r>
-              <w:t>Yes - one React page includes routine block creation, editing, completion, deletion, search, filters, summary cards, progress bar, and category totals.</w:t>
+              <w:t>Yes - one React app includes routine block creation, editing, completion, deletion, search, filters, summary cards, progress bar, category totals, and three dynamically generated views.</w:t>
             </w:r>
           </w:p>
         </w:tc>
@@ -208,7 +208,7 @@
           </w:tcPr>
           <w:p>
             <w:r>
-              <w:t>Yes - user input updates the visible routine list, status, hours, progress, category totals, and filters.</w:t>
+              <w:t>Yes - user input updates the visible routine list, status, hours, progress, category totals, filters, Day Summary view, and Completion Review view.</w:t>
             </w:r>
           </w:p>
         </w:tc>

</xml_diff>